<commit_message>
segundo commit se crean ventanas de las Entidades del MVC
</commit_message>
<xml_diff>
--- a/Guide_Fullstack.docx
+++ b/Guide_Fullstack.docx
@@ -2166,7 +2166,7 @@
           <w:noProof/>
         </w:rPr>
         <w:drawing>
-          <wp:inline distT="0" distB="0" distL="0" distR="0" wp14:anchorId="6DE5FBE2" wp14:editId="7EC6EDAA">
+          <wp:inline distT="0" distB="0" distL="0" distR="0" wp14:anchorId="6DE5FBE2" wp14:editId="0D4CAEF6">
             <wp:extent cx="5644465" cy="2438400"/>
             <wp:effectExtent l="0" t="0" r="0" b="0"/>
             <wp:docPr id="1867522980" name="Imagen 2"/>
@@ -28720,10 +28720,416 @@
     <w:p>
       <w:pPr>
         <w:pStyle w:val="Prrafodelista"/>
+        <w:numPr>
+          <w:ilvl w:val="0"/>
+          <w:numId w:val="3"/>
+        </w:numPr>
         <w:tabs>
           <w:tab w:val="left" w:pos="2550"/>
         </w:tabs>
       </w:pPr>
+      <w:r>
+        <w:t xml:space="preserve">Crear Controladores para ingreso a las paginas y se visualicen en el </w:t>
+      </w:r>
+      <w:proofErr w:type="spellStart"/>
+      <w:r>
+        <w:t>RenderBody</w:t>
+      </w:r>
+      <w:proofErr w:type="spellEnd"/>
+      <w:r>
+        <w:t xml:space="preserve"> del </w:t>
+      </w:r>
+      <w:proofErr w:type="spellStart"/>
+      <w:r>
+        <w:t>Layout</w:t>
+      </w:r>
+      <w:proofErr w:type="spellEnd"/>
+    </w:p>
+    <w:p>
+      <w:pPr>
+        <w:pStyle w:val="Prrafodelista"/>
+        <w:tabs>
+          <w:tab w:val="left" w:pos="2550"/>
+        </w:tabs>
+        <w:rPr>
+          <w:color w:val="E97132" w:themeColor="accent2"/>
+        </w:rPr>
+      </w:pPr>
+    </w:p>
+    <w:p>
+      <w:pPr>
+        <w:pStyle w:val="Prrafodelista"/>
+        <w:tabs>
+          <w:tab w:val="left" w:pos="2550"/>
+        </w:tabs>
+        <w:rPr>
+          <w:color w:val="BF4E14" w:themeColor="accent2" w:themeShade="BF"/>
+        </w:rPr>
+      </w:pPr>
+      <w:r>
+        <w:rPr>
+          <w:color w:val="BF4E14" w:themeColor="accent2" w:themeShade="BF"/>
+        </w:rPr>
+        <w:t>@{</w:t>
+      </w:r>
+    </w:p>
+    <w:p>
+      <w:pPr>
+        <w:pStyle w:val="Prrafodelista"/>
+        <w:tabs>
+          <w:tab w:val="left" w:pos="2550"/>
+        </w:tabs>
+        <w:rPr>
+          <w:color w:val="BF4E14" w:themeColor="accent2" w:themeShade="BF"/>
+        </w:rPr>
+      </w:pPr>
+      <w:r>
+        <w:rPr>
+          <w:color w:val="BF4E14" w:themeColor="accent2" w:themeShade="BF"/>
+        </w:rPr>
+        <w:t xml:space="preserve">    </w:t>
+      </w:r>
+      <w:proofErr w:type="spellStart"/>
+      <w:r>
+        <w:rPr>
+          <w:color w:val="BF4E14" w:themeColor="accent2" w:themeShade="BF"/>
+        </w:rPr>
+        <w:t>Layout</w:t>
+      </w:r>
+      <w:proofErr w:type="spellEnd"/>
+      <w:r>
+        <w:rPr>
+          <w:color w:val="BF4E14" w:themeColor="accent2" w:themeShade="BF"/>
+        </w:rPr>
+        <w:t xml:space="preserve"> = "~/</w:t>
+      </w:r>
+      <w:proofErr w:type="spellStart"/>
+      <w:r>
+        <w:rPr>
+          <w:color w:val="BF4E14" w:themeColor="accent2" w:themeShade="BF"/>
+        </w:rPr>
+        <w:t>Views</w:t>
+      </w:r>
+      <w:proofErr w:type="spellEnd"/>
+      <w:r>
+        <w:rPr>
+          <w:color w:val="BF4E14" w:themeColor="accent2" w:themeShade="BF"/>
+        </w:rPr>
+        <w:t>/</w:t>
+      </w:r>
+      <w:proofErr w:type="spellStart"/>
+      <w:r>
+        <w:rPr>
+          <w:color w:val="BF4E14" w:themeColor="accent2" w:themeShade="BF"/>
+        </w:rPr>
+        <w:t>Shared</w:t>
+      </w:r>
+      <w:proofErr w:type="spellEnd"/>
+      <w:r>
+        <w:rPr>
+          <w:color w:val="BF4E14" w:themeColor="accent2" w:themeShade="BF"/>
+        </w:rPr>
+        <w:t>/_</w:t>
+      </w:r>
+      <w:proofErr w:type="spellStart"/>
+      <w:r>
+        <w:rPr>
+          <w:color w:val="BF4E14" w:themeColor="accent2" w:themeShade="BF"/>
+        </w:rPr>
+        <w:t>Layout.cshtml</w:t>
+      </w:r>
+      <w:proofErr w:type="spellEnd"/>
+      <w:r>
+        <w:rPr>
+          <w:color w:val="BF4E14" w:themeColor="accent2" w:themeShade="BF"/>
+        </w:rPr>
+        <w:t>";</w:t>
+      </w:r>
+    </w:p>
+    <w:p>
+      <w:pPr>
+        <w:pStyle w:val="Prrafodelista"/>
+        <w:tabs>
+          <w:tab w:val="left" w:pos="2550"/>
+        </w:tabs>
+        <w:rPr>
+          <w:color w:val="BF4E14" w:themeColor="accent2" w:themeShade="BF"/>
+        </w:rPr>
+      </w:pPr>
+      <w:r>
+        <w:rPr>
+          <w:color w:val="BF4E14" w:themeColor="accent2" w:themeShade="BF"/>
+        </w:rPr>
+        <w:t xml:space="preserve">    </w:t>
+      </w:r>
+      <w:proofErr w:type="spellStart"/>
+      <w:r>
+        <w:rPr>
+          <w:color w:val="BF4E14" w:themeColor="accent2" w:themeShade="BF"/>
+        </w:rPr>
+        <w:t>ViewData</w:t>
+      </w:r>
+      <w:proofErr w:type="spellEnd"/>
+      <w:r>
+        <w:rPr>
+          <w:color w:val="BF4E14" w:themeColor="accent2" w:themeShade="BF"/>
+        </w:rPr>
+        <w:t>["</w:t>
+      </w:r>
+      <w:proofErr w:type="spellStart"/>
+      <w:r>
+        <w:rPr>
+          <w:color w:val="BF4E14" w:themeColor="accent2" w:themeShade="BF"/>
+        </w:rPr>
+        <w:t>Title</w:t>
+      </w:r>
+      <w:proofErr w:type="spellEnd"/>
+      <w:r>
+        <w:rPr>
+          <w:color w:val="BF4E14" w:themeColor="accent2" w:themeShade="BF"/>
+        </w:rPr>
+        <w:t>"] = "Productos";</w:t>
+      </w:r>
+    </w:p>
+    <w:p>
+      <w:pPr>
+        <w:pStyle w:val="Prrafodelista"/>
+        <w:tabs>
+          <w:tab w:val="left" w:pos="2550"/>
+        </w:tabs>
+        <w:rPr>
+          <w:color w:val="BF4E14" w:themeColor="accent2" w:themeShade="BF"/>
+        </w:rPr>
+      </w:pPr>
+      <w:r>
+        <w:rPr>
+          <w:color w:val="BF4E14" w:themeColor="accent2" w:themeShade="BF"/>
+        </w:rPr>
+        <w:t>}</w:t>
+      </w:r>
+    </w:p>
+    <w:p>
+      <w:pPr>
+        <w:pStyle w:val="Prrafodelista"/>
+        <w:tabs>
+          <w:tab w:val="left" w:pos="2550"/>
+        </w:tabs>
+        <w:rPr>
+          <w:color w:val="E97132" w:themeColor="accent2"/>
+        </w:rPr>
+      </w:pPr>
+    </w:p>
+    <w:p>
+      <w:pPr>
+        <w:pStyle w:val="Prrafodelista"/>
+        <w:tabs>
+          <w:tab w:val="left" w:pos="2550"/>
+        </w:tabs>
+      </w:pPr>
+    </w:p>
+    <w:p>
+      <w:pPr>
+        <w:pStyle w:val="Prrafodelista"/>
+        <w:tabs>
+          <w:tab w:val="left" w:pos="2550"/>
+        </w:tabs>
+        <w:rPr>
+          <w:color w:val="E97132" w:themeColor="accent2"/>
+        </w:rPr>
+      </w:pPr>
+    </w:p>
+    <w:p>
+      <w:pPr>
+        <w:pStyle w:val="Prrafodelista"/>
+        <w:numPr>
+          <w:ilvl w:val="0"/>
+          <w:numId w:val="3"/>
+        </w:numPr>
+        <w:tabs>
+          <w:tab w:val="left" w:pos="2550"/>
+        </w:tabs>
+      </w:pPr>
+      <w:r>
+        <w:lastRenderedPageBreak/>
+        <w:t xml:space="preserve">Habilitar el controlador para cerrar la </w:t>
+      </w:r>
+      <w:proofErr w:type="spellStart"/>
+      <w:r>
+        <w:t>sensión</w:t>
+      </w:r>
+      <w:proofErr w:type="spellEnd"/>
+    </w:p>
+    <w:p>
+      <w:pPr>
+        <w:pStyle w:val="Prrafodelista"/>
+        <w:tabs>
+          <w:tab w:val="left" w:pos="2550"/>
+        </w:tabs>
+      </w:pPr>
+      <w:proofErr w:type="spellStart"/>
+      <w:r>
+        <w:t>dotnet</w:t>
+      </w:r>
+      <w:proofErr w:type="spellEnd"/>
+      <w:r>
+        <w:t xml:space="preserve"> </w:t>
+      </w:r>
+      <w:proofErr w:type="spellStart"/>
+      <w:r>
+        <w:t>add</w:t>
+      </w:r>
+      <w:proofErr w:type="spellEnd"/>
+      <w:r>
+        <w:t xml:space="preserve"> </w:t>
+      </w:r>
+      <w:proofErr w:type="spellStart"/>
+      <w:r>
+        <w:t>package</w:t>
+      </w:r>
+      <w:proofErr w:type="spellEnd"/>
+      <w:r>
+        <w:t xml:space="preserve"> </w:t>
+      </w:r>
+      <w:proofErr w:type="spellStart"/>
+      <w:proofErr w:type="gramStart"/>
+      <w:r>
+        <w:t>Microsoft.AspNetCore.Authentication</w:t>
+      </w:r>
+      <w:proofErr w:type="spellEnd"/>
+      <w:proofErr w:type="gramEnd"/>
+    </w:p>
+    <w:p>
+      <w:pPr>
+        <w:pStyle w:val="Prrafodelista"/>
+        <w:tabs>
+          <w:tab w:val="left" w:pos="2550"/>
+        </w:tabs>
+      </w:pPr>
+    </w:p>
+    <w:p>
+      <w:pPr>
+        <w:pStyle w:val="Prrafodelista"/>
+        <w:numPr>
+          <w:ilvl w:val="0"/>
+          <w:numId w:val="3"/>
+        </w:numPr>
+        <w:tabs>
+          <w:tab w:val="left" w:pos="2550"/>
+        </w:tabs>
+      </w:pPr>
+      <w:r>
+        <w:t xml:space="preserve">Controlador de acceso a los </w:t>
+      </w:r>
+      <w:proofErr w:type="spellStart"/>
+      <w:r>
+        <w:t>index</w:t>
+      </w:r>
+      <w:proofErr w:type="spellEnd"/>
+      <w:r>
+        <w:t xml:space="preserve"> de:</w:t>
+      </w:r>
+    </w:p>
+    <w:p>
+      <w:pPr>
+        <w:pStyle w:val="Prrafodelista"/>
+        <w:numPr>
+          <w:ilvl w:val="1"/>
+          <w:numId w:val="3"/>
+        </w:numPr>
+        <w:tabs>
+          <w:tab w:val="left" w:pos="2550"/>
+        </w:tabs>
+      </w:pPr>
+      <w:r>
+        <w:t>Configuración</w:t>
+      </w:r>
+    </w:p>
+    <w:p>
+      <w:pPr>
+        <w:pStyle w:val="Prrafodelista"/>
+        <w:numPr>
+          <w:ilvl w:val="1"/>
+          <w:numId w:val="3"/>
+        </w:numPr>
+        <w:tabs>
+          <w:tab w:val="left" w:pos="2550"/>
+        </w:tabs>
+      </w:pPr>
+      <w:r>
+        <w:t>Usuarios</w:t>
+      </w:r>
+    </w:p>
+    <w:p>
+      <w:pPr>
+        <w:pStyle w:val="Prrafodelista"/>
+        <w:numPr>
+          <w:ilvl w:val="1"/>
+          <w:numId w:val="3"/>
+        </w:numPr>
+        <w:tabs>
+          <w:tab w:val="left" w:pos="2550"/>
+        </w:tabs>
+      </w:pPr>
+      <w:r>
+        <w:t>Categorías</w:t>
+      </w:r>
+    </w:p>
+    <w:p>
+      <w:pPr>
+        <w:pStyle w:val="Prrafodelista"/>
+        <w:numPr>
+          <w:ilvl w:val="1"/>
+          <w:numId w:val="3"/>
+        </w:numPr>
+        <w:tabs>
+          <w:tab w:val="left" w:pos="2550"/>
+        </w:tabs>
+      </w:pPr>
+      <w:r>
+        <w:t>Marcas</w:t>
+      </w:r>
+    </w:p>
+    <w:p>
+      <w:pPr>
+        <w:pStyle w:val="Prrafodelista"/>
+        <w:numPr>
+          <w:ilvl w:val="1"/>
+          <w:numId w:val="3"/>
+        </w:numPr>
+        <w:tabs>
+          <w:tab w:val="left" w:pos="2550"/>
+        </w:tabs>
+      </w:pPr>
+      <w:r>
+        <w:t>Productos</w:t>
+      </w:r>
+    </w:p>
+    <w:p>
+      <w:pPr>
+        <w:tabs>
+          <w:tab w:val="left" w:pos="2550"/>
+        </w:tabs>
+        <w:ind w:left="1080"/>
+      </w:pPr>
+      <w:r>
+        <w:t>Ventanas Emergentes</w:t>
+      </w:r>
+    </w:p>
+    <w:p>
+      <w:pPr>
+        <w:tabs>
+          <w:tab w:val="left" w:pos="2550"/>
+        </w:tabs>
+        <w:ind w:left="1080"/>
+      </w:pPr>
+      <w:proofErr w:type="spellStart"/>
+      <w:r>
+        <w:t>Categoria</w:t>
+      </w:r>
+      <w:proofErr w:type="spellEnd"/>
+      <w:r>
+        <w:t xml:space="preserve"> queda añadido </w:t>
+      </w:r>
     </w:p>
     <w:sectPr>
       <w:pgSz w:w="12240" w:h="15840"/>

</xml_diff>